<commit_message>
Refine report typography and prepare develop delivery [report]
</commit_message>
<xml_diff>
--- a/REPORT/NhomXX_LANLMS_Report.docx
+++ b/REPORT/NhomXX_LANLMS_Report.docx
@@ -3470,7 +3470,7 @@
     </w:p>
     <w:p>
       <w:r>
-        <w:t>[6] LAN-LMS repository. Đặc tả 1.2, API, tests và raw experiments. https://github.com/VQuyy-1458/LAN-LMS .</w:t>
+        <w:t>[6] LAN-LMS repository. Đặc tả 1.2, API, tests và raw experiments. https://github.com/VQuyy-1458/LAN-LMS/tree/develop .</w:t>
       </w:r>
     </w:p>
     <w:p>
@@ -4465,7 +4465,7 @@
       <w:outlineLvl w:val="0"/>
     </w:pPr>
     <w:rPr>
-      <w:rFonts w:asciiTheme="majorHAnsi" w:eastAsiaTheme="majorEastAsia" w:hAnsiTheme="majorHAnsi" w:cstheme="majorBidi" w:ascii="Times New Roman" w:hAnsi="Times New Roman" w:eastAsia="Times New Roman"/>
+      <w:rFonts w:ascii="Times New Roman" w:hAnsi="Times New Roman" w:eastAsia="Times New Roman"/>
       <w:b/>
       <w:bCs/>
       <w:color w:val="000000"/>
@@ -4489,7 +4489,7 @@
       <w:outlineLvl w:val="1"/>
     </w:pPr>
     <w:rPr>
-      <w:rFonts w:asciiTheme="majorHAnsi" w:eastAsiaTheme="majorEastAsia" w:hAnsiTheme="majorHAnsi" w:cstheme="majorBidi" w:ascii="Times New Roman" w:hAnsi="Times New Roman" w:eastAsia="Times New Roman"/>
+      <w:rFonts w:ascii="Times New Roman" w:hAnsi="Times New Roman" w:eastAsia="Times New Roman"/>
       <w:b/>
       <w:bCs/>
       <w:color w:val="000000"/>
@@ -4748,14 +4748,11 @@
     <w:rsid w:val="00FC693F"/>
     <w:pPr>
       <w:keepNext/>
-      <w:pBdr>
-        <w:bottom w:val="single" w:sz="8" w:space="4" w:color="4F81BD" w:themeColor="accent1"/>
-      </w:pBdr>
       <w:spacing w:after="140" w:line="240" w:lineRule="auto" w:before="260"/>
       <w:contextualSpacing/>
     </w:pPr>
     <w:rPr>
-      <w:rFonts w:asciiTheme="majorHAnsi" w:eastAsiaTheme="majorEastAsia" w:hAnsiTheme="majorHAnsi" w:cstheme="majorBidi" w:ascii="Times New Roman" w:hAnsi="Times New Roman" w:eastAsia="Times New Roman"/>
+      <w:rFonts w:ascii="Times New Roman" w:hAnsi="Times New Roman" w:eastAsia="Times New Roman"/>
       <w:b/>
       <w:color w:val="000000"/>
       <w:spacing w:val="5"/>
@@ -4795,7 +4792,7 @@
       <w:spacing w:before="260" w:after="140"/>
     </w:pPr>
     <w:rPr>
-      <w:rFonts w:asciiTheme="majorHAnsi" w:eastAsiaTheme="majorEastAsia" w:hAnsiTheme="majorHAnsi" w:cstheme="majorBidi" w:ascii="Times New Roman" w:hAnsi="Times New Roman" w:eastAsia="Times New Roman"/>
+      <w:rFonts w:ascii="Times New Roman" w:hAnsi="Times New Roman" w:eastAsia="Times New Roman"/>
       <w:b w:val="0"/>
       <w:i/>
       <w:iCs/>

</xml_diff>

<commit_message>
Balance report cover title and verify final layout [report]
</commit_message>
<xml_diff>
--- a/REPORT/NhomXX_LANLMS_Report.docx
+++ b/REPORT/NhomXX_LANLMS_Report.docx
@@ -8,7 +8,9 @@
         <w:jc w:val="center"/>
       </w:pPr>
       <w:r>
-        <w:t>Hệ thống học tập và thi lập trình trong mạng LAN</w:t>
+        <w:t>Hệ thống học tập và thi lập trình</w:t>
+        <w:br/>
+        <w:t>trong mạng LAN</w:t>
       </w:r>
     </w:p>
     <w:p>

</xml_diff>